<commit_message>
agrega mecanismo de monitoreo para perfiles depen.
- 1.5: explica paso a paso cómo se confirma el cumplimiento de
  rutinas de cuidado (confirmación directa o por proxy del cuidador),
  dentro de la sección Descripción del Proyecto APT
- Guion: agrega respuesta preparada para la pregunta anticipada
  sobre cómo se verifica hidratación/medicación
</commit_message>
<xml_diff>
--- a/Fase 1/Evidencias Grupales/1.5_GuiaEstudiante_Fase1_DefinicionProyectoAPT_PerfilMedico.docx
+++ b/Fase 1/Evidencias Grupales/1.5_GuiaEstudiante_Fase1_DefinicionProyectoAPT_PerfilMedico.docx
@@ -1589,20 +1589,109 @@
                 <w:highlight w:val="cyan"/>
               </w:rPr>
             </w:pPr>
-            <w:r>
-              <w:rPr>
-                <w:i w:val="0"/>
-                <w:iCs w:val="0"/>
-                <w:sz w:val="22"/>
-                <w:szCs w:val="22"/>
-                <w:rtl w:val="0"/>
-              </w:rPr>
-              <w:t xml:space="preserve">Se espera desarrollar una plataforma compuesta por una aplicación móvil (Flutter) y un backend web (FastAPI + PostgreSQL) que centralice la información de salud personal y familiar bajo un modelo de cuenta titular con perfiles dependientes. El titular administra su propio perfil de salud y puede crear y gestionar perfiles dependientes, registrando medicamentos, rutinas de cuidado, controles e indicadores de salud. El sistema confirma actividades, genera recordatorios y escala alertas hacia el titular o los cuidadores autorizados cuando una actividad no se confirma a tiempo, siguiendo el flujo: Planificar → Recordar → Confirmar → Monitorear → Alertar → Acompañar.</w:t>
-            </w:r>
-            <w:r>
-              <w:rPr>
-                <w:rtl w:val="0"/>
-              </w:rPr>
+            <w:r/>
+            <w:r>
+              <w:rPr>
+                <w:b w:val="0"/>
+                <w:sz w:val="22"/>
+              </w:rPr>
+              <w:t>Se espera desarrollar una plataforma compuesta por una aplicación móvil (Flutter) y un backend web (FastAPI + PostgreSQL) que centralice la información de salud personal y familiar bajo un modelo de cuenta titular con perfiles dependientes. El titular administra su propio perfil de salud y puede crear y gestionar perfiles dependientes, registrando medicamentos, rutinas de cuidado, controles e indicadores de salud. El sistema confirma actividades, genera recordatorios y escala alertas hacia el titular o los cuidadores autorizados cuando una actividad no se confirma a tiempo, siguiendo el flujo: Planificar → Recordar → Confirmar → Monitorear → Alertar → Acompañar.</w:t>
+            </w:r>
+          </w:p>
+          <w:p>
+            <w:pPr>
+              <w:jc w:val="left"/>
+            </w:pPr>
+            <w:r>
+              <w:rPr>
+                <w:b/>
+                <w:sz w:val="22"/>
+              </w:rPr>
+              <w:t>Mecanismo de monitoreo para perfiles dependientes y/o no valentes:</w:t>
+            </w:r>
+          </w:p>
+          <w:p>
+            <w:pPr>
+              <w:jc w:val="left"/>
+            </w:pPr>
+            <w:r>
+              <w:rPr>
+                <w:b w:val="0"/>
+                <w:sz w:val="22"/>
+              </w:rPr>
+              <w:t>El sistema no puede verificar físicamente que una persona se administró un medicamento o se hidrató (eso requeriría sensores o dispositivos externos, fuera del alcance de este proyecto). Por eso el monitoreo se implementa mediante un mecanismo de confirmación reportada, de la misma forma en que operan aplicaciones de salud existentes en el mercado (ej. Medisafe, MyTherapy). El detalle paso a paso es el siguiente:</w:t>
+            </w:r>
+          </w:p>
+          <w:p>
+            <w:pPr>
+              <w:jc w:val="left"/>
+            </w:pPr>
+            <w:r>
+              <w:rPr>
+                <w:b w:val="0"/>
+                <w:sz w:val="22"/>
+              </w:rPr>
+              <w:t>1. Planificar: el titular o un cuidador autorizado configura, para cada perfil dependiente, una rutina de cuidado que especifica qué (ej. Losartán), cuánto (dosis, ej. 50 mg, 1 comprimido) y cuándo (horario y frecuencia, ej. 08:00 y 20:00).</w:t>
+            </w:r>
+          </w:p>
+          <w:p>
+            <w:pPr>
+              <w:jc w:val="left"/>
+            </w:pPr>
+            <w:r>
+              <w:rPr>
+                <w:b w:val="0"/>
+                <w:sz w:val="22"/>
+              </w:rPr>
+              <w:t>2. Recordar: en el horario programado, el sistema envía una notificación push al perfil correspondiente recordando la actividad pendiente.</w:t>
+            </w:r>
+          </w:p>
+          <w:p>
+            <w:pPr>
+              <w:jc w:val="left"/>
+            </w:pPr>
+            <w:r>
+              <w:rPr>
+                <w:b w:val="0"/>
+                <w:sz w:val="22"/>
+              </w:rPr>
+              <w:t>3. Confirmar: si la persona dependiente puede usar la aplicación, confirma la actividad directamente (ej. "Ya lo tomé"). Si no puede o no sabe usar la app —el caso más frecuente en adultos mayores con baja alfabetización digital—, el cuidador confirma en su nombre desde su propio perfil, quedando registrado como confirmación por proxy. La dosis y el medicamento no se reingresan cada vez: quedan fijados al crear la rutina, y solo se confirma su cumplimiento, reduciendo el margen de error humano en el registro.</w:t>
+            </w:r>
+          </w:p>
+          <w:p>
+            <w:pPr>
+              <w:jc w:val="left"/>
+            </w:pPr>
+            <w:r>
+              <w:rPr>
+                <w:b w:val="0"/>
+                <w:sz w:val="22"/>
+              </w:rPr>
+              <w:t>4. Monitorear: cada confirmación (o ausencia de ella) se guarda con marca de tiempo en la base de datos, construyendo un historial de cumplimiento por perfil dependiente (ej. porcentaje de dosis confirmadas en los últimos 7 días).</w:t>
+            </w:r>
+          </w:p>
+          <w:p>
+            <w:pPr>
+              <w:jc w:val="left"/>
+            </w:pPr>
+            <w:r>
+              <w:rPr>
+                <w:b w:val="0"/>
+                <w:sz w:val="22"/>
+              </w:rPr>
+              <w:t>5. Alertar: si transcurre un tiempo de tolerancia (ej. 30-60 minutos) sin confirmación, el sistema escala el aviso: primero un segundo recordatorio al propio perfil y, si continúa sin respuesta, una notificación al cuidador autorizado.</w:t>
+            </w:r>
+          </w:p>
+          <w:p>
+            <w:pPr>
+              <w:jc w:val="left"/>
+            </w:pPr>
+            <w:r>
+              <w:rPr>
+                <w:b w:val="0"/>
+                <w:sz w:val="22"/>
+              </w:rPr>
+              <w:t>6. Acompañar: el cuidador visualiza, desde su propia cuenta, un resumen del estado de cumplimiento de todos los perfiles dependientes a su cargo (ej. "hidratación: 3/4 hoy", "medicamento de las 20:00: pendiente"), sin necesidad de estar físicamente presente para saber si la persona a su cargo está cumpliendo su rutina de cuidado.</w:t>
             </w:r>
           </w:p>
         </w:tc>

</xml_diff>

<commit_message>
clarifica división de trabajo en integración de IA
- 1.5, PPT y guion: distingue explícitamente el rol de Benjamín
  (orquestación de la API de IA) del rol de Sergio (contexto de
  datos y almacenamiento de resultados), evitando ambigüedad
  sobre "quién hace la IA"
- Plan de Trabajo: agrega a Benjamín como responsable de la fila
  "Módulo de IA y botón de asistencia"
</commit_message>
<xml_diff>
--- a/Fase 1/Evidencias Grupales/1.5_GuiaEstudiante_Fase1_DefinicionProyectoAPT_PerfilMedico.docx
+++ b/Fase 1/Evidencias Grupales/1.5_GuiaEstudiante_Fase1_DefinicionProyectoAPT_PerfilMedico.docx
@@ -1852,7 +1852,7 @@
               <w:rPr>
                 <w:rtl w:val="0"/>
               </w:rPr>
-              <w:t xml:space="preserve">Mis intereses profesionales se centran en el modelado y administración de bases de datos, así como en la integración práctica de Inteligencia Artificial para la resolución de problemas. Este proyecto refleja directamente mis intereses a través de mi rol en el diseño y estructuración de la base de datos en PostgreSQL, garantizando un almacenamiento seguro, escalable y ordenado para las cuentas titulares, perfiles dependientes y registros de salud. Además, me encargo de la integración del módulo de IA para procesar datos y entregar orientación inteligente dentro de la plataforma. A cinco años me proyecto trabajando en el área de ingeniería y gestión de datos, especializándome en arquitecturas de información y soluciones potenciadas con inteligencia artificial. </w:t>
+              <w:t xml:space="preserve">Mis intereses profesionales se centran en el modelado y administración de bases de datos, así como en la integración práctica de Inteligencia Artificial para la resolución de problemas. Este proyecto refleja directamente mis intereses a través de mi rol en el diseño y estructuración de la base de datos en PostgreSQL, garantizando un almacenamiento seguro, escalable y ordenado para las cuentas titulares, perfiles dependientes y registros de salud. Además, defino qué datos del perfil se utilizan como contexto para el módulo de IA y estructuro en la base de datos los resultados que este entrega, para ofrecer orientación inteligente dentro de la plataforma. A cinco años me proyecto trabajando en el área de ingeniería y gestión de datos, especializándome en arquitecturas de información y soluciones potenciadas con inteligencia artificial. </w:t>
             </w:r>
           </w:p>
           <w:p>
@@ -2739,7 +2739,7 @@
                 <w:szCs w:val="22"/>
                 <w:rtl w:val="0"/>
               </w:rPr>
-              <w:t xml:space="preserve">• Benjamín Leiva — Backend (Python + FastAPI): diseño de la API REST, autenticación JWT, lógica de negocio, integración con notificaciones e IA.</w:t>
+              <w:t>• Benjamín Leiva — Backend (Python + FastAPI): diseño de la API REST, autenticación JWT, lógica de negocio, orquestación de la llamada a la API de IA (envío de consultas, manejo de errores) e integración con notificaciones.</w:t>
             </w:r>
             <w:r>
               <w:rPr>
@@ -2760,7 +2760,7 @@
                 <w:szCs w:val="22"/>
                 <w:rtl w:val="0"/>
               </w:rPr>
-              <w:t xml:space="preserve">• Sergio Ocares — Base de datos + IA (PostgreSQL): modelado y administración de la base de datos, indicadores y reportes de cumplimiento, integración del módulo de IA.</w:t>
+              <w:t>• Sergio Ocares — Base de datos + IA (PostgreSQL): modelado y administración de la base de datos, indicadores y reportes de cumplimiento, definición del contexto de datos enviado a la API de IA y almacenamiento de sus resultados.</w:t>
             </w:r>
             <w:r>
               <w:rPr>
@@ -6930,20 +6930,12 @@
                 <w:szCs w:val="18"/>
               </w:rPr>
             </w:pPr>
-            <w:r>
-              <w:rPr>
-                <w:i w:val="0"/>
-                <w:iCs w:val="0"/>
-                <w:sz w:val="22"/>
-                <w:szCs w:val="22"/>
-                <w:rtl w:val="0"/>
-              </w:rPr>
-              <w:t xml:space="preserve">Integración de API de IA para orientación general y botón de ayuda.</w:t>
-            </w:r>
-            <w:r>
-              <w:rPr>
-                <w:rtl w:val="0"/>
-              </w:rPr>
+            <w:r/>
+            <w:r>
+              <w:rPr>
+                <w:sz w:val="20"/>
+              </w:rPr>
+              <w:t>Backend (Benjamín) orquesta la llamada a la API de IA; base de datos (Sergio) define el contexto enviado y almacena resultados; app (Matías) integra el botón de ayuda.</w:t>
             </w:r>
           </w:p>
         </w:tc>
@@ -7032,20 +7024,12 @@
                 <w:szCs w:val="18"/>
               </w:rPr>
             </w:pPr>
-            <w:r>
-              <w:rPr>
-                <w:i w:val="0"/>
-                <w:iCs w:val="0"/>
-                <w:sz w:val="22"/>
-                <w:szCs w:val="22"/>
-                <w:rtl w:val="0"/>
-              </w:rPr>
-              <w:t xml:space="preserve">Sergio / Matías</w:t>
-            </w:r>
-            <w:r>
-              <w:rPr>
-                <w:rtl w:val="0"/>
-              </w:rPr>
+            <w:r/>
+            <w:r>
+              <w:rPr>
+                <w:sz w:val="20"/>
+              </w:rPr>
+              <w:t>Benjamín / Sergio / Matías</w:t>
             </w:r>
           </w:p>
         </w:tc>

</xml_diff>

<commit_message>
Integra 3 funcionalidades al proyecto
- Agrega modo "pantalla en casa" (tablet + Fully Kiosk Browser),
  integración con pulsera inteligente (Health Connect) y detección
  de ruido fuerte (micrófono del dispositivo) como respuesta al
  pedido del docente de diferenciar el proyecto
- 1.5: nuevos objetivos específicos, sección de diferenciadores,
  nota de factibilidad, y actividades agregadas a Plan de Trabajo
  y Carta Gantt (semanas 13-15)
- PPT: nueva slide de diferenciadores; guion actualizado
- Se evitó fabricar hardware propio (sensor de sonido dedicado):
  se prioriza tecnología de bajo costo ya existente en el mercado
- Product Backlog: extiende la historia "Interfaz simplificada" para
  incluir el modo pantalla en casa; agrega 2 épicas nuevas (pulsera
  inteligente, detección de ruido)
- Cronograma Semestral: menciona las 3 funciones en semanas 13-15,
  coherente con la Carta Gantt del 1.5
</commit_message>
<xml_diff>
--- a/Fase 1/Evidencias Grupales/1.5_GuiaEstudiante_Fase1_DefinicionProyectoAPT_PerfilMedico.docx
+++ b/Fase 1/Evidencias Grupales/1.5_GuiaEstudiante_Fase1_DefinicionProyectoAPT_PerfilMedico.docx
@@ -1694,6 +1694,29 @@
               <w:t>6. Acompañar: el cuidador visualiza, desde su propia cuenta, un resumen del estado de cumplimiento de todos los perfiles dependientes a su cargo (ej. "hidratación: 3/4 hoy", "medicamento de las 20:00: pendiente"), sin necesidad de estar físicamente presente para saber si la persona a su cargo está cumpliendo su rutina de cuidado.</w:t>
             </w:r>
           </w:p>
+          <w:p>
+            <w:pPr>
+              <w:jc w:val="left"/>
+            </w:pPr>
+            <w:r>
+              <w:rPr>
+                <w:b/>
+                <w:sz w:val="22"/>
+              </w:rPr>
+              <w:t>Elementos diferenciadores frente a soluciones similares:</w:t>
+            </w:r>
+          </w:p>
+          <w:p>
+            <w:pPr>
+              <w:jc w:val="left"/>
+            </w:pPr>
+            <w:r>
+              <w:rPr>
+                <w:sz w:val="22"/>
+              </w:rPr>
+              <w:t>Además del núcleo descrito, Perfil Médico+ incorpora tres funcionalidades que lo distinguen de aplicaciones de recordatorio de medicamentos genéricas: un modo "pantalla en casa" para tablets fijas pensado para adultos mayores que no manejan un smartphone, integración con pulseras inteligentes para mostrar signos vitales, y detección de sonidos fuertes en el hogar como señal temprana de una posible caída u otro incidente.</w:t>
+            </w:r>
+          </w:p>
         </w:tc>
       </w:tr>
       <w:tr>
@@ -1928,6 +1951,29 @@
               <w:rPr>
                 <w:rtl w:val="0"/>
               </w:rPr>
+            </w:r>
+          </w:p>
+          <w:p>
+            <w:pPr>
+              <w:jc w:val="left"/>
+            </w:pPr>
+            <w:r>
+              <w:rPr>
+                <w:b/>
+                <w:sz w:val="22"/>
+              </w:rPr>
+              <w:t>Factibilidad de las funcionalidades diferenciadoras:</w:t>
+            </w:r>
+          </w:p>
+          <w:p>
+            <w:pPr>
+              <w:jc w:val="left"/>
+            </w:pPr>
+            <w:r>
+              <w:rPr>
+                <w:sz w:val="22"/>
+              </w:rPr>
+              <w:t>Estas tres funcionalidades se plantean como incrementos sobre el MVP base y se priorizarán según el avance del equipo durante la Fase 2, ya que se apoyan en tecnología de bajo costo y APIs gratuitas ya validadas: el modo "pantalla en casa" reutiliza la misma aplicación Flutter mediante Fully Kiosk Browser (gratuito) sobre una tablet Android económica; la integración de pulseras se realiza a través de Health Connect, la API gratuita y oficial de Android para datos de salud, sin necesidad de desarrollar hardware propio; y la detección de sonido utiliza el micrófono nativo del dispositivo, sin sensores adicionales. Ninguna de las tres requiere conocimientos de electrónica o fabricación de hardware, manteniéndose dentro del stack tecnológico ya declarado por el equipo.</w:t>
             </w:r>
           </w:p>
         </w:tc>
@@ -2287,125 +2333,100 @@
                 <w:szCs w:val="20"/>
               </w:rPr>
             </w:pPr>
-            <w:r>
-              <w:rPr>
-                <w:i w:val="0"/>
-                <w:iCs w:val="0"/>
-                <w:sz w:val="22"/>
-                <w:szCs w:val="22"/>
-                <w:rtl w:val="0"/>
-              </w:rPr>
-              <w:t xml:space="preserve">1. Implementar un módulo de autenticación y gestión de cuentas, donde cada titular pueda administrar su propio perfil y crear/vincular perfiles dependientes.</w:t>
-            </w:r>
-            <w:r>
-              <w:rPr>
-                <w:rtl w:val="0"/>
-              </w:rPr>
-            </w:r>
-          </w:p>
-          <w:p>
-            <w:pPr>
-              <w:jc w:val="left"/>
-              <w:rPr/>
-            </w:pPr>
-            <w:r>
-              <w:rPr>
-                <w:i w:val="0"/>
-                <w:iCs w:val="0"/>
-                <w:sz w:val="22"/>
-                <w:szCs w:val="22"/>
-                <w:rtl w:val="0"/>
-              </w:rPr>
-              <w:t xml:space="preserve">2. Desarrollar el registro y seguimiento de rutinas de cuidado (medicamentos, alimentación, hidratación) con confirmación de actividades.</w:t>
-            </w:r>
-            <w:r>
-              <w:rPr>
-                <w:rtl w:val="0"/>
-              </w:rPr>
-            </w:r>
-          </w:p>
-          <w:p>
-            <w:pPr>
-              <w:jc w:val="left"/>
-              <w:rPr/>
-            </w:pPr>
-            <w:r>
-              <w:rPr>
-                <w:i w:val="0"/>
-                <w:iCs w:val="0"/>
-                <w:sz w:val="22"/>
-                <w:szCs w:val="22"/>
-                <w:rtl w:val="0"/>
-              </w:rPr>
-              <w:t xml:space="preserve">3. Diseñar un sistema de permisos configurables que permita invitar cuidadores adicionales a un perfil dependiente específico.</w:t>
-            </w:r>
-            <w:r>
-              <w:rPr>
-                <w:rtl w:val="0"/>
-              </w:rPr>
-            </w:r>
-          </w:p>
-          <w:p>
-            <w:pPr>
-              <w:jc w:val="left"/>
-              <w:rPr/>
-            </w:pPr>
-            <w:r>
-              <w:rPr>
-                <w:i w:val="0"/>
-                <w:iCs w:val="0"/>
-                <w:sz w:val="22"/>
-                <w:szCs w:val="22"/>
-                <w:rtl w:val="0"/>
-              </w:rPr>
-              <w:t xml:space="preserve">4. Construir un sistema de recordatorios y alertas escalonadas ante actividades no confirmadas dentro del plazo esperado.</w:t>
-            </w:r>
-            <w:r>
-              <w:rPr>
-                <w:rtl w:val="0"/>
-              </w:rPr>
-            </w:r>
-          </w:p>
-          <w:p>
-            <w:pPr>
-              <w:jc w:val="left"/>
-              <w:rPr/>
-            </w:pPr>
-            <w:r>
-              <w:rPr>
-                <w:i w:val="0"/>
-                <w:iCs w:val="0"/>
-                <w:sz w:val="22"/>
-                <w:szCs w:val="22"/>
-                <w:rtl w:val="0"/>
-              </w:rPr>
-              <w:t xml:space="preserve">5. Incorporar el registro de indicadores de salud y un historial de cumplimiento visualizable mediante gráficos.</w:t>
-            </w:r>
-            <w:r>
-              <w:rPr>
-                <w:rtl w:val="0"/>
-              </w:rPr>
-            </w:r>
-          </w:p>
-          <w:p>
-            <w:pPr>
-              <w:jc w:val="left"/>
-              <w:rPr/>
-            </w:pPr>
-            <w:r>
-              <w:rPr>
-                <w:i w:val="0"/>
-                <w:iCs w:val="0"/>
-                <w:sz w:val="22"/>
-                <w:szCs w:val="22"/>
-                <w:rtl w:val="0"/>
-              </w:rPr>
-              <w:t xml:space="preserve">6. Integrar un módulo de orientación general basado en inteligencia artificial que utilice la información registrada en el perfil.</w:t>
-            </w:r>
-            <w:r>
-              <w:rPr>
-                <w:rtl w:val="0"/>
-              </w:rPr>
+            <w:r/>
+            <w:r>
+              <w:rPr>
+                <w:sz w:val="22"/>
+              </w:rPr>
+              <w:t>1. Implementar un módulo de autenticación y gestión de cuentas, donde cada titular pueda administrar su propio perfil y crear/vincular perfiles dependientes.</w:t>
+            </w:r>
+          </w:p>
+          <w:p>
+            <w:pPr>
+              <w:jc w:val="left"/>
+            </w:pPr>
+            <w:r>
+              <w:rPr>
+                <w:sz w:val="22"/>
+              </w:rPr>
+              <w:t>2. Desarrollar el registro y seguimiento de rutinas de cuidado (medicamentos, alimentación, hidratación) con confirmación de actividades.</w:t>
+            </w:r>
+          </w:p>
+          <w:p>
+            <w:pPr>
+              <w:jc w:val="left"/>
+            </w:pPr>
+            <w:r>
+              <w:rPr>
+                <w:sz w:val="22"/>
+              </w:rPr>
+              <w:t>3. Diseñar un sistema de permisos configurables que permita invitar cuidadores adicionales a un perfil dependiente específico.</w:t>
+            </w:r>
+          </w:p>
+          <w:p>
+            <w:pPr>
+              <w:jc w:val="left"/>
+            </w:pPr>
+            <w:r>
+              <w:rPr>
+                <w:sz w:val="22"/>
+              </w:rPr>
+              <w:t>4. Construir un sistema de recordatorios y alertas escalonadas ante actividades no confirmadas dentro del plazo esperado.</w:t>
+            </w:r>
+          </w:p>
+          <w:p>
+            <w:pPr>
+              <w:jc w:val="left"/>
+            </w:pPr>
+            <w:r>
+              <w:rPr>
+                <w:sz w:val="22"/>
+              </w:rPr>
+              <w:t>5. Incorporar el registro de indicadores de salud y un historial de cumplimiento visualizable mediante gráficos.</w:t>
+            </w:r>
+          </w:p>
+          <w:p>
+            <w:pPr>
+              <w:jc w:val="left"/>
+            </w:pPr>
+            <w:r>
+              <w:rPr>
+                <w:sz w:val="22"/>
+              </w:rPr>
+              <w:t>6. Integrar un módulo de orientación general basado en inteligencia artificial que utilice la información registrada en el perfil.</w:t>
+            </w:r>
+          </w:p>
+          <w:p>
+            <w:pPr>
+              <w:jc w:val="left"/>
+            </w:pPr>
+            <w:r>
+              <w:rPr>
+                <w:sz w:val="22"/>
+              </w:rPr>
+              <w:t>7. Implementar un modo "pantalla en casa" de la aplicación, optimizado para tablets fijas, con botones grandes y confirmación simplificada pensada para el adulto mayor.</w:t>
+            </w:r>
+          </w:p>
+          <w:p>
+            <w:pPr>
+              <w:jc w:val="left"/>
+            </w:pPr>
+            <w:r>
+              <w:rPr>
+                <w:sz w:val="22"/>
+              </w:rPr>
+              <w:t>8. Integrar datos de dispositivos wearables (pulseras inteligentes) mediante Health Connect, mostrando indicadores de signos vitales dentro del perfil.</w:t>
+            </w:r>
+          </w:p>
+          <w:p>
+            <w:pPr>
+              <w:jc w:val="left"/>
+            </w:pPr>
+            <w:r>
+              <w:rPr>
+                <w:sz w:val="22"/>
+              </w:rPr>
+              <w:t>9. Incorporar detección de sonidos fuertes mediante el micrófono del dispositivo, generando una alerta al cuidador ante un posible incidente en el hogar.</w:t>
             </w:r>
           </w:p>
         </w:tc>
@@ -7061,6 +7082,534 @@
               <w:rPr>
                 <w:rtl w:val="0"/>
               </w:rPr>
+            </w:r>
+          </w:p>
+        </w:tc>
+      </w:tr>
+      <w:tr>
+        <w:trPr>
+          <w:cantSplit w:val="0"/>
+          <w:tblHeader w:val="0"/>
+        </w:trPr>
+        <w:tc>
+          <w:tcPr/>
+          <w:p>
+            <w:pPr>
+              <w:jc w:val="left"/>
+              <w:rPr>
+                <w:rFonts w:ascii="Calibri" w:cs="Calibri" w:eastAsia="Calibri" w:hAnsi="Calibri"/>
+                <w:i w:val="1"/>
+                <w:iCs w:val="1"/>
+                <w:color w:val="548dd4"/>
+                <w:sz w:val="18"/>
+                <w:szCs w:val="18"/>
+              </w:rPr>
+            </w:pPr>
+            <w:r/>
+            <w:r>
+              <w:rPr>
+                <w:sz w:val="20"/>
+              </w:rPr>
+              <w:t>C4</w:t>
+            </w:r>
+          </w:p>
+        </w:tc>
+        <w:tc>
+          <w:tcPr/>
+          <w:p>
+            <w:pPr>
+              <w:jc w:val="left"/>
+              <w:rPr>
+                <w:rFonts w:ascii="Calibri" w:cs="Calibri" w:eastAsia="Calibri" w:hAnsi="Calibri"/>
+                <w:i w:val="1"/>
+                <w:iCs w:val="1"/>
+                <w:color w:val="548dd4"/>
+                <w:sz w:val="18"/>
+                <w:szCs w:val="18"/>
+              </w:rPr>
+            </w:pPr>
+            <w:r/>
+            <w:r>
+              <w:rPr>
+                <w:sz w:val="20"/>
+              </w:rPr>
+              <w:t>Modo pantalla en casa (tablet)</w:t>
+            </w:r>
+          </w:p>
+        </w:tc>
+        <w:tc>
+          <w:tcPr/>
+          <w:p>
+            <w:pPr>
+              <w:jc w:val="left"/>
+              <w:rPr>
+                <w:rFonts w:ascii="Calibri" w:cs="Calibri" w:eastAsia="Calibri" w:hAnsi="Calibri"/>
+                <w:i w:val="1"/>
+                <w:iCs w:val="1"/>
+                <w:color w:val="548dd4"/>
+                <w:sz w:val="18"/>
+                <w:szCs w:val="18"/>
+              </w:rPr>
+            </w:pPr>
+            <w:r/>
+            <w:r>
+              <w:rPr>
+                <w:sz w:val="20"/>
+              </w:rPr>
+              <w:t>Vista alternativa de la app con botones grandes y confirmación simplificada, pensada para tablets fijas en el hogar del adulto mayor.</w:t>
+            </w:r>
+          </w:p>
+        </w:tc>
+        <w:tc>
+          <w:tcPr/>
+          <w:p>
+            <w:pPr>
+              <w:jc w:val="left"/>
+              <w:rPr>
+                <w:rFonts w:ascii="Calibri" w:cs="Calibri" w:eastAsia="Calibri" w:hAnsi="Calibri"/>
+                <w:i w:val="1"/>
+                <w:iCs w:val="1"/>
+                <w:color w:val="548dd4"/>
+                <w:sz w:val="18"/>
+                <w:szCs w:val="18"/>
+              </w:rPr>
+            </w:pPr>
+            <w:r/>
+            <w:r>
+              <w:rPr>
+                <w:sz w:val="20"/>
+              </w:rPr>
+              <w:t>Flutter, Fully Kiosk Browser, tablet Android</w:t>
+            </w:r>
+          </w:p>
+        </w:tc>
+        <w:tc>
+          <w:tcPr>
+            <w:tcBorders>
+              <w:right w:color="ffffff" w:space="0" w:sz="4" w:val="single"/>
+            </w:tcBorders>
+          </w:tcPr>
+          <w:p>
+            <w:pPr>
+              <w:jc w:val="left"/>
+              <w:rPr>
+                <w:rFonts w:ascii="Calibri" w:cs="Calibri" w:eastAsia="Calibri" w:hAnsi="Calibri"/>
+                <w:i w:val="1"/>
+                <w:iCs w:val="1"/>
+                <w:color w:val="548dd4"/>
+                <w:sz w:val="18"/>
+                <w:szCs w:val="18"/>
+              </w:rPr>
+            </w:pPr>
+            <w:r/>
+            <w:r>
+              <w:rPr>
+                <w:sz w:val="20"/>
+              </w:rPr>
+              <w:t>Semanas 13-14</w:t>
+            </w:r>
+          </w:p>
+        </w:tc>
+        <w:tc>
+          <w:tcPr>
+            <w:tcBorders>
+              <w:left w:color="ffffff" w:space="0" w:sz="4" w:val="single"/>
+            </w:tcBorders>
+            <w:shd w:fill="d9d9d9" w:val="clear"/>
+          </w:tcPr>
+          <w:p>
+            <w:pPr>
+              <w:jc w:val="left"/>
+              <w:rPr>
+                <w:rFonts w:ascii="Calibri" w:cs="Calibri" w:eastAsia="Calibri" w:hAnsi="Calibri"/>
+                <w:i w:val="1"/>
+                <w:iCs w:val="1"/>
+                <w:color w:val="548dd4"/>
+                <w:sz w:val="18"/>
+                <w:szCs w:val="18"/>
+              </w:rPr>
+            </w:pPr>
+            <w:r/>
+            <w:r>
+              <w:rPr>
+                <w:sz w:val="20"/>
+              </w:rPr>
+              <w:t>Matías</w:t>
+            </w:r>
+          </w:p>
+        </w:tc>
+        <w:tc>
+          <w:tcPr/>
+          <w:p>
+            <w:pPr>
+              <w:jc w:val="left"/>
+              <w:rPr>
+                <w:rFonts w:ascii="Calibri" w:cs="Calibri" w:eastAsia="Calibri" w:hAnsi="Calibri"/>
+                <w:i w:val="1"/>
+                <w:iCs w:val="1"/>
+                <w:color w:val="548dd4"/>
+                <w:sz w:val="18"/>
+                <w:szCs w:val="18"/>
+              </w:rPr>
+            </w:pPr>
+            <w:r/>
+            <w:r>
+              <w:rPr>
+                <w:sz w:val="20"/>
+              </w:rPr>
+              <w:t>Facilitador: reutiliza la interfaz ya construida. Obstáculo: adaptar el diseño a pantallas de mayor tamaño.</w:t>
+            </w:r>
+          </w:p>
+        </w:tc>
+      </w:tr>
+      <w:tr>
+        <w:trPr>
+          <w:cantSplit w:val="0"/>
+          <w:tblHeader w:val="0"/>
+        </w:trPr>
+        <w:tc>
+          <w:tcPr/>
+          <w:p>
+            <w:pPr>
+              <w:jc w:val="left"/>
+              <w:rPr>
+                <w:rFonts w:ascii="Calibri" w:cs="Calibri" w:eastAsia="Calibri" w:hAnsi="Calibri"/>
+                <w:i w:val="1"/>
+                <w:iCs w:val="1"/>
+                <w:color w:val="548dd4"/>
+                <w:sz w:val="18"/>
+                <w:szCs w:val="18"/>
+              </w:rPr>
+            </w:pPr>
+            <w:r/>
+            <w:r>
+              <w:rPr>
+                <w:sz w:val="20"/>
+              </w:rPr>
+              <w:t>C4</w:t>
+            </w:r>
+          </w:p>
+        </w:tc>
+        <w:tc>
+          <w:tcPr/>
+          <w:p>
+            <w:pPr>
+              <w:jc w:val="left"/>
+              <w:rPr>
+                <w:rFonts w:ascii="Calibri" w:cs="Calibri" w:eastAsia="Calibri" w:hAnsi="Calibri"/>
+                <w:i w:val="1"/>
+                <w:iCs w:val="1"/>
+                <w:color w:val="548dd4"/>
+                <w:sz w:val="18"/>
+                <w:szCs w:val="18"/>
+              </w:rPr>
+            </w:pPr>
+            <w:r/>
+            <w:r>
+              <w:rPr>
+                <w:sz w:val="20"/>
+              </w:rPr>
+              <w:t>Integración con pulsera inteligente</w:t>
+            </w:r>
+          </w:p>
+        </w:tc>
+        <w:tc>
+          <w:tcPr/>
+          <w:p>
+            <w:pPr>
+              <w:jc w:val="left"/>
+              <w:rPr>
+                <w:rFonts w:ascii="Calibri" w:cs="Calibri" w:eastAsia="Calibri" w:hAnsi="Calibri"/>
+                <w:i w:val="1"/>
+                <w:iCs w:val="1"/>
+                <w:color w:val="548dd4"/>
+                <w:sz w:val="18"/>
+                <w:szCs w:val="18"/>
+              </w:rPr>
+            </w:pPr>
+            <w:r/>
+            <w:r>
+              <w:rPr>
+                <w:sz w:val="20"/>
+              </w:rPr>
+              <w:t>Lectura de frecuencia cardíaca y otros indicadores desde Health Connect para mostrarlos en el perfil de salud.</w:t>
+            </w:r>
+          </w:p>
+        </w:tc>
+        <w:tc>
+          <w:tcPr/>
+          <w:p>
+            <w:pPr>
+              <w:jc w:val="left"/>
+              <w:rPr>
+                <w:rFonts w:ascii="Calibri" w:cs="Calibri" w:eastAsia="Calibri" w:hAnsi="Calibri"/>
+                <w:i w:val="1"/>
+                <w:iCs w:val="1"/>
+                <w:color w:val="548dd4"/>
+                <w:sz w:val="18"/>
+                <w:szCs w:val="18"/>
+              </w:rPr>
+            </w:pPr>
+            <w:r/>
+            <w:r>
+              <w:rPr>
+                <w:sz w:val="20"/>
+              </w:rPr>
+              <w:t>Health Connect API, pulsera Xiaomi</w:t>
+            </w:r>
+          </w:p>
+        </w:tc>
+        <w:tc>
+          <w:tcPr>
+            <w:tcBorders>
+              <w:right w:color="ffffff" w:space="0" w:sz="4" w:val="single"/>
+            </w:tcBorders>
+          </w:tcPr>
+          <w:p>
+            <w:pPr>
+              <w:jc w:val="left"/>
+              <w:rPr>
+                <w:rFonts w:ascii="Calibri" w:cs="Calibri" w:eastAsia="Calibri" w:hAnsi="Calibri"/>
+                <w:i w:val="1"/>
+                <w:iCs w:val="1"/>
+                <w:color w:val="548dd4"/>
+                <w:sz w:val="18"/>
+                <w:szCs w:val="18"/>
+              </w:rPr>
+            </w:pPr>
+            <w:r/>
+            <w:r>
+              <w:rPr>
+                <w:sz w:val="20"/>
+              </w:rPr>
+              <w:t>Semana 14</w:t>
+            </w:r>
+          </w:p>
+        </w:tc>
+        <w:tc>
+          <w:tcPr>
+            <w:tcBorders>
+              <w:left w:color="ffffff" w:space="0" w:sz="4" w:val="single"/>
+            </w:tcBorders>
+            <w:shd w:fill="d9d9d9" w:val="clear"/>
+          </w:tcPr>
+          <w:p>
+            <w:pPr>
+              <w:jc w:val="left"/>
+              <w:rPr>
+                <w:rFonts w:ascii="Calibri" w:cs="Calibri" w:eastAsia="Calibri" w:hAnsi="Calibri"/>
+                <w:i w:val="1"/>
+                <w:iCs w:val="1"/>
+                <w:color w:val="548dd4"/>
+                <w:sz w:val="18"/>
+                <w:szCs w:val="18"/>
+              </w:rPr>
+            </w:pPr>
+            <w:r/>
+            <w:r>
+              <w:rPr>
+                <w:sz w:val="20"/>
+              </w:rPr>
+              <w:t>Sergio / Benjamín</w:t>
+            </w:r>
+          </w:p>
+        </w:tc>
+        <w:tc>
+          <w:tcPr/>
+          <w:p>
+            <w:pPr>
+              <w:jc w:val="left"/>
+              <w:rPr>
+                <w:rFonts w:ascii="Calibri" w:cs="Calibri" w:eastAsia="Calibri" w:hAnsi="Calibri"/>
+                <w:i w:val="1"/>
+                <w:iCs w:val="1"/>
+                <w:color w:val="548dd4"/>
+                <w:sz w:val="18"/>
+                <w:szCs w:val="18"/>
+              </w:rPr>
+            </w:pPr>
+            <w:r/>
+            <w:r>
+              <w:rPr>
+                <w:sz w:val="20"/>
+              </w:rPr>
+              <w:t>Facilitador: API gratuita y documentada por Google. Obstáculo: primera vez integrando datos de wearables.</w:t>
+            </w:r>
+          </w:p>
+        </w:tc>
+      </w:tr>
+      <w:tr>
+        <w:trPr>
+          <w:cantSplit w:val="0"/>
+          <w:tblHeader w:val="0"/>
+        </w:trPr>
+        <w:tc>
+          <w:tcPr/>
+          <w:p>
+            <w:pPr>
+              <w:jc w:val="left"/>
+              <w:rPr>
+                <w:rFonts w:ascii="Calibri" w:cs="Calibri" w:eastAsia="Calibri" w:hAnsi="Calibri"/>
+                <w:i w:val="1"/>
+                <w:iCs w:val="1"/>
+                <w:color w:val="548dd4"/>
+                <w:sz w:val="18"/>
+                <w:szCs w:val="18"/>
+              </w:rPr>
+            </w:pPr>
+            <w:r/>
+            <w:r>
+              <w:rPr>
+                <w:sz w:val="20"/>
+              </w:rPr>
+              <w:t>C4</w:t>
+            </w:r>
+          </w:p>
+        </w:tc>
+        <w:tc>
+          <w:tcPr/>
+          <w:p>
+            <w:pPr>
+              <w:jc w:val="left"/>
+              <w:rPr>
+                <w:rFonts w:ascii="Calibri" w:cs="Calibri" w:eastAsia="Calibri" w:hAnsi="Calibri"/>
+                <w:i w:val="1"/>
+                <w:iCs w:val="1"/>
+                <w:color w:val="548dd4"/>
+                <w:sz w:val="18"/>
+                <w:szCs w:val="18"/>
+              </w:rPr>
+            </w:pPr>
+            <w:r/>
+            <w:r>
+              <w:rPr>
+                <w:sz w:val="20"/>
+              </w:rPr>
+              <w:t>Detección de ruido fuerte</w:t>
+            </w:r>
+          </w:p>
+        </w:tc>
+        <w:tc>
+          <w:tcPr/>
+          <w:p>
+            <w:pPr>
+              <w:jc w:val="left"/>
+              <w:rPr>
+                <w:rFonts w:ascii="Calibri" w:cs="Calibri" w:eastAsia="Calibri" w:hAnsi="Calibri"/>
+                <w:i w:val="1"/>
+                <w:iCs w:val="1"/>
+                <w:color w:val="548dd4"/>
+                <w:sz w:val="18"/>
+                <w:szCs w:val="18"/>
+              </w:rPr>
+            </w:pPr>
+            <w:r/>
+            <w:r>
+              <w:rPr>
+                <w:sz w:val="20"/>
+              </w:rPr>
+              <w:t>Monitoreo del micrófono del dispositivo para detectar sonidos fuertes y generar una alerta automática al cuidador.</w:t>
+            </w:r>
+          </w:p>
+        </w:tc>
+        <w:tc>
+          <w:tcPr/>
+          <w:p>
+            <w:pPr>
+              <w:jc w:val="left"/>
+              <w:rPr>
+                <w:rFonts w:ascii="Calibri" w:cs="Calibri" w:eastAsia="Calibri" w:hAnsi="Calibri"/>
+                <w:i w:val="1"/>
+                <w:iCs w:val="1"/>
+                <w:color w:val="548dd4"/>
+                <w:sz w:val="18"/>
+                <w:szCs w:val="18"/>
+              </w:rPr>
+            </w:pPr>
+            <w:r/>
+            <w:r>
+              <w:rPr>
+                <w:sz w:val="20"/>
+              </w:rPr>
+              <w:t>Flutter (noise_meter), micrófono nativo</w:t>
+            </w:r>
+          </w:p>
+        </w:tc>
+        <w:tc>
+          <w:tcPr>
+            <w:tcBorders>
+              <w:right w:color="ffffff" w:space="0" w:sz="4" w:val="single"/>
+            </w:tcBorders>
+          </w:tcPr>
+          <w:p>
+            <w:pPr>
+              <w:jc w:val="left"/>
+              <w:rPr>
+                <w:rFonts w:ascii="Calibri" w:cs="Calibri" w:eastAsia="Calibri" w:hAnsi="Calibri"/>
+                <w:i w:val="1"/>
+                <w:iCs w:val="1"/>
+                <w:color w:val="548dd4"/>
+                <w:sz w:val="18"/>
+                <w:szCs w:val="18"/>
+              </w:rPr>
+            </w:pPr>
+            <w:r/>
+            <w:r>
+              <w:rPr>
+                <w:sz w:val="20"/>
+              </w:rPr>
+              <w:t>Semana 15</w:t>
+            </w:r>
+          </w:p>
+        </w:tc>
+        <w:tc>
+          <w:tcPr>
+            <w:tcBorders>
+              <w:left w:color="ffffff" w:space="0" w:sz="4" w:val="single"/>
+            </w:tcBorders>
+            <w:shd w:fill="d9d9d9" w:val="clear"/>
+          </w:tcPr>
+          <w:p>
+            <w:pPr>
+              <w:jc w:val="left"/>
+              <w:rPr>
+                <w:rFonts w:ascii="Calibri" w:cs="Calibri" w:eastAsia="Calibri" w:hAnsi="Calibri"/>
+                <w:i w:val="1"/>
+                <w:iCs w:val="1"/>
+                <w:color w:val="548dd4"/>
+                <w:sz w:val="18"/>
+                <w:szCs w:val="18"/>
+              </w:rPr>
+            </w:pPr>
+            <w:r/>
+            <w:r>
+              <w:rPr>
+                <w:sz w:val="20"/>
+              </w:rPr>
+              <w:t>Matías / Benjamín</w:t>
+            </w:r>
+          </w:p>
+        </w:tc>
+        <w:tc>
+          <w:tcPr/>
+          <w:p>
+            <w:pPr>
+              <w:jc w:val="left"/>
+              <w:rPr>
+                <w:rFonts w:ascii="Calibri" w:cs="Calibri" w:eastAsia="Calibri" w:hAnsi="Calibri"/>
+                <w:i w:val="1"/>
+                <w:iCs w:val="1"/>
+                <w:color w:val="548dd4"/>
+                <w:sz w:val="18"/>
+                <w:szCs w:val="18"/>
+              </w:rPr>
+            </w:pPr>
+            <w:r/>
+            <w:r>
+              <w:rPr>
+                <w:sz w:val="20"/>
+              </w:rPr>
+              <w:t>Facilitador: no requiere hardware adicional. Obstáculo: calibrar el umbral de sonido para evitar falsas alertas.</w:t>
             </w:r>
           </w:p>
         </w:tc>
@@ -12163,6 +12712,1237 @@
             <w:r>
               <w:rPr>
                 <w:rtl w:val="0"/>
+              </w:rPr>
+            </w:r>
+          </w:p>
+        </w:tc>
+      </w:tr>
+      <w:tr>
+        <w:trPr>
+          <w:cantSplit w:val="0"/>
+          <w:trHeight w:val="294" w:hRule="atLeast"/>
+          <w:tblHeader w:val="0"/>
+        </w:trPr>
+        <w:tc>
+          <w:tcPr/>
+          <w:p>
+            <w:pPr>
+              <w:spacing w:line="360" w:lineRule="auto"/>
+              <w:jc w:val="left"/>
+              <w:rPr>
+                <w:b w:val="1"/>
+                <w:bCs w:val="1"/>
+                <w:sz w:val="16"/>
+                <w:szCs w:val="16"/>
+              </w:rPr>
+            </w:pPr>
+            <w:r/>
+            <w:r>
+              <w:rPr>
+                <w:sz w:val="20"/>
+              </w:rPr>
+              <w:t>Modo pantalla en casa (tablet)</w:t>
+            </w:r>
+          </w:p>
+        </w:tc>
+        <w:tc>
+          <w:tcPr/>
+          <w:p>
+            <w:pPr>
+              <w:spacing w:line="360" w:lineRule="auto"/>
+              <w:jc w:val="left"/>
+              <w:rPr>
+                <w:b w:val="1"/>
+                <w:bCs w:val="1"/>
+                <w:sz w:val="16"/>
+                <w:szCs w:val="16"/>
+              </w:rPr>
+            </w:pPr>
+            <w:r/>
+            <w:r>
+              <w:rPr>
+                <w:sz w:val="20"/>
+              </w:rPr>
+            </w:r>
+          </w:p>
+        </w:tc>
+        <w:tc>
+          <w:tcPr/>
+          <w:p>
+            <w:pPr>
+              <w:spacing w:line="360" w:lineRule="auto"/>
+              <w:jc w:val="left"/>
+              <w:rPr>
+                <w:b w:val="1"/>
+                <w:bCs w:val="1"/>
+                <w:sz w:val="16"/>
+                <w:szCs w:val="16"/>
+              </w:rPr>
+            </w:pPr>
+            <w:r/>
+            <w:r>
+              <w:rPr>
+                <w:sz w:val="20"/>
+              </w:rPr>
+            </w:r>
+          </w:p>
+        </w:tc>
+        <w:tc>
+          <w:tcPr/>
+          <w:p>
+            <w:pPr>
+              <w:spacing w:line="360" w:lineRule="auto"/>
+              <w:jc w:val="left"/>
+              <w:rPr>
+                <w:b w:val="1"/>
+                <w:bCs w:val="1"/>
+                <w:sz w:val="16"/>
+                <w:szCs w:val="16"/>
+              </w:rPr>
+            </w:pPr>
+            <w:r/>
+            <w:r>
+              <w:rPr>
+                <w:sz w:val="20"/>
+              </w:rPr>
+            </w:r>
+          </w:p>
+        </w:tc>
+        <w:tc>
+          <w:tcPr/>
+          <w:p>
+            <w:pPr>
+              <w:spacing w:line="360" w:lineRule="auto"/>
+              <w:jc w:val="left"/>
+              <w:rPr>
+                <w:b w:val="1"/>
+                <w:bCs w:val="1"/>
+                <w:sz w:val="16"/>
+                <w:szCs w:val="16"/>
+              </w:rPr>
+            </w:pPr>
+            <w:r/>
+            <w:r>
+              <w:rPr>
+                <w:sz w:val="20"/>
+              </w:rPr>
+            </w:r>
+          </w:p>
+        </w:tc>
+        <w:tc>
+          <w:tcPr/>
+          <w:p>
+            <w:pPr>
+              <w:spacing w:line="360" w:lineRule="auto"/>
+              <w:jc w:val="left"/>
+              <w:rPr>
+                <w:b w:val="1"/>
+                <w:bCs w:val="1"/>
+                <w:sz w:val="16"/>
+                <w:szCs w:val="16"/>
+              </w:rPr>
+            </w:pPr>
+            <w:r/>
+            <w:r>
+              <w:rPr>
+                <w:sz w:val="20"/>
+              </w:rPr>
+            </w:r>
+          </w:p>
+        </w:tc>
+        <w:tc>
+          <w:tcPr/>
+          <w:p>
+            <w:pPr>
+              <w:spacing w:line="360" w:lineRule="auto"/>
+              <w:jc w:val="left"/>
+              <w:rPr>
+                <w:b w:val="1"/>
+                <w:bCs w:val="1"/>
+                <w:sz w:val="16"/>
+                <w:szCs w:val="16"/>
+              </w:rPr>
+            </w:pPr>
+            <w:r/>
+            <w:r>
+              <w:rPr>
+                <w:sz w:val="20"/>
+              </w:rPr>
+            </w:r>
+          </w:p>
+        </w:tc>
+        <w:tc>
+          <w:tcPr/>
+          <w:p>
+            <w:pPr>
+              <w:spacing w:line="360" w:lineRule="auto"/>
+              <w:jc w:val="left"/>
+              <w:rPr>
+                <w:b w:val="1"/>
+                <w:bCs w:val="1"/>
+                <w:sz w:val="16"/>
+                <w:szCs w:val="16"/>
+              </w:rPr>
+            </w:pPr>
+            <w:r/>
+            <w:r>
+              <w:rPr>
+                <w:sz w:val="20"/>
+              </w:rPr>
+            </w:r>
+          </w:p>
+        </w:tc>
+        <w:tc>
+          <w:tcPr/>
+          <w:p>
+            <w:pPr>
+              <w:spacing w:line="360" w:lineRule="auto"/>
+              <w:jc w:val="left"/>
+              <w:rPr>
+                <w:b w:val="1"/>
+                <w:bCs w:val="1"/>
+                <w:sz w:val="16"/>
+                <w:szCs w:val="16"/>
+              </w:rPr>
+            </w:pPr>
+            <w:r/>
+            <w:r>
+              <w:rPr>
+                <w:sz w:val="20"/>
+              </w:rPr>
+            </w:r>
+          </w:p>
+        </w:tc>
+        <w:tc>
+          <w:tcPr/>
+          <w:p>
+            <w:pPr>
+              <w:spacing w:line="360" w:lineRule="auto"/>
+              <w:jc w:val="left"/>
+              <w:rPr>
+                <w:b w:val="1"/>
+                <w:bCs w:val="1"/>
+                <w:sz w:val="16"/>
+                <w:szCs w:val="16"/>
+              </w:rPr>
+            </w:pPr>
+            <w:r/>
+            <w:r>
+              <w:rPr>
+                <w:sz w:val="20"/>
+              </w:rPr>
+            </w:r>
+          </w:p>
+        </w:tc>
+        <w:tc>
+          <w:tcPr/>
+          <w:p>
+            <w:pPr>
+              <w:spacing w:line="360" w:lineRule="auto"/>
+              <w:jc w:val="left"/>
+              <w:rPr>
+                <w:b w:val="1"/>
+                <w:bCs w:val="1"/>
+                <w:sz w:val="16"/>
+                <w:szCs w:val="16"/>
+              </w:rPr>
+            </w:pPr>
+            <w:r/>
+            <w:r>
+              <w:rPr>
+                <w:sz w:val="20"/>
+              </w:rPr>
+            </w:r>
+          </w:p>
+        </w:tc>
+        <w:tc>
+          <w:tcPr/>
+          <w:p>
+            <w:pPr>
+              <w:spacing w:line="360" w:lineRule="auto"/>
+              <w:jc w:val="left"/>
+              <w:rPr>
+                <w:b w:val="1"/>
+                <w:bCs w:val="1"/>
+                <w:sz w:val="16"/>
+                <w:szCs w:val="16"/>
+              </w:rPr>
+            </w:pPr>
+            <w:r/>
+            <w:r>
+              <w:rPr>
+                <w:sz w:val="20"/>
+              </w:rPr>
+            </w:r>
+          </w:p>
+        </w:tc>
+        <w:tc>
+          <w:tcPr/>
+          <w:p>
+            <w:pPr>
+              <w:spacing w:line="360" w:lineRule="auto"/>
+              <w:jc w:val="left"/>
+              <w:rPr>
+                <w:b w:val="1"/>
+                <w:bCs w:val="1"/>
+                <w:sz w:val="16"/>
+                <w:szCs w:val="16"/>
+              </w:rPr>
+            </w:pPr>
+            <w:r/>
+            <w:r>
+              <w:rPr>
+                <w:sz w:val="20"/>
+              </w:rPr>
+            </w:r>
+          </w:p>
+        </w:tc>
+        <w:tc>
+          <w:tcPr/>
+          <w:p>
+            <w:pPr>
+              <w:spacing w:line="360" w:lineRule="auto"/>
+              <w:jc w:val="left"/>
+              <w:rPr>
+                <w:b w:val="1"/>
+                <w:bCs w:val="1"/>
+                <w:sz w:val="16"/>
+                <w:szCs w:val="16"/>
+              </w:rPr>
+            </w:pPr>
+            <w:r/>
+            <w:r>
+              <w:rPr>
+                <w:sz w:val="20"/>
+              </w:rPr>
+              <w:t>X</w:t>
+            </w:r>
+          </w:p>
+        </w:tc>
+        <w:tc>
+          <w:tcPr/>
+          <w:p>
+            <w:pPr>
+              <w:spacing w:line="360" w:lineRule="auto"/>
+              <w:jc w:val="left"/>
+              <w:rPr>
+                <w:b w:val="1"/>
+                <w:bCs w:val="1"/>
+                <w:sz w:val="16"/>
+                <w:szCs w:val="16"/>
+              </w:rPr>
+            </w:pPr>
+            <w:r/>
+            <w:r>
+              <w:rPr>
+                <w:sz w:val="20"/>
+              </w:rPr>
+              <w:t>X</w:t>
+            </w:r>
+          </w:p>
+        </w:tc>
+        <w:tc>
+          <w:tcPr/>
+          <w:p>
+            <w:pPr>
+              <w:spacing w:line="360" w:lineRule="auto"/>
+              <w:jc w:val="left"/>
+              <w:rPr>
+                <w:b w:val="1"/>
+                <w:bCs w:val="1"/>
+                <w:sz w:val="16"/>
+                <w:szCs w:val="16"/>
+              </w:rPr>
+            </w:pPr>
+            <w:r/>
+            <w:r>
+              <w:rPr>
+                <w:sz w:val="20"/>
+              </w:rPr>
+            </w:r>
+          </w:p>
+        </w:tc>
+        <w:tc>
+          <w:tcPr>
+            <w:gridSpan w:val="2"/>
+          </w:tcPr>
+          <w:p>
+            <w:pPr>
+              <w:spacing w:line="360" w:lineRule="auto"/>
+              <w:jc w:val="left"/>
+              <w:rPr>
+                <w:b w:val="1"/>
+                <w:bCs w:val="1"/>
+                <w:sz w:val="16"/>
+                <w:szCs w:val="16"/>
+              </w:rPr>
+            </w:pPr>
+            <w:r/>
+            <w:r>
+              <w:rPr>
+                <w:sz w:val="20"/>
+              </w:rPr>
+            </w:r>
+          </w:p>
+        </w:tc>
+        <w:tc>
+          <w:tcPr/>
+          <w:p>
+            <w:pPr>
+              <w:spacing w:line="360" w:lineRule="auto"/>
+              <w:jc w:val="left"/>
+              <w:rPr>
+                <w:b w:val="1"/>
+                <w:bCs w:val="1"/>
+                <w:sz w:val="16"/>
+                <w:szCs w:val="16"/>
+              </w:rPr>
+            </w:pPr>
+            <w:r/>
+            <w:r>
+              <w:rPr>
+                <w:sz w:val="20"/>
+              </w:rPr>
+            </w:r>
+          </w:p>
+        </w:tc>
+        <w:tc>
+          <w:tcPr/>
+          <w:p>
+            <w:pPr>
+              <w:spacing w:line="360" w:lineRule="auto"/>
+              <w:jc w:val="left"/>
+              <w:rPr>
+                <w:b w:val="1"/>
+                <w:bCs w:val="1"/>
+                <w:sz w:val="16"/>
+                <w:szCs w:val="16"/>
+              </w:rPr>
+            </w:pPr>
+            <w:r/>
+            <w:r>
+              <w:rPr>
+                <w:sz w:val="20"/>
+              </w:rPr>
+            </w:r>
+          </w:p>
+        </w:tc>
+      </w:tr>
+      <w:tr>
+        <w:trPr>
+          <w:cantSplit w:val="0"/>
+          <w:trHeight w:val="294" w:hRule="atLeast"/>
+          <w:tblHeader w:val="0"/>
+        </w:trPr>
+        <w:tc>
+          <w:tcPr/>
+          <w:p>
+            <w:pPr>
+              <w:spacing w:line="360" w:lineRule="auto"/>
+              <w:jc w:val="left"/>
+              <w:rPr>
+                <w:b w:val="1"/>
+                <w:bCs w:val="1"/>
+                <w:sz w:val="16"/>
+                <w:szCs w:val="16"/>
+              </w:rPr>
+            </w:pPr>
+            <w:r/>
+            <w:r>
+              <w:rPr>
+                <w:sz w:val="20"/>
+              </w:rPr>
+              <w:t>Integración con pulsera inteligente</w:t>
+            </w:r>
+          </w:p>
+        </w:tc>
+        <w:tc>
+          <w:tcPr/>
+          <w:p>
+            <w:pPr>
+              <w:spacing w:line="360" w:lineRule="auto"/>
+              <w:jc w:val="left"/>
+              <w:rPr>
+                <w:b w:val="1"/>
+                <w:bCs w:val="1"/>
+                <w:sz w:val="16"/>
+                <w:szCs w:val="16"/>
+              </w:rPr>
+            </w:pPr>
+            <w:r/>
+            <w:r>
+              <w:rPr>
+                <w:sz w:val="20"/>
+              </w:rPr>
+            </w:r>
+          </w:p>
+        </w:tc>
+        <w:tc>
+          <w:tcPr/>
+          <w:p>
+            <w:pPr>
+              <w:spacing w:line="360" w:lineRule="auto"/>
+              <w:jc w:val="left"/>
+              <w:rPr>
+                <w:b w:val="1"/>
+                <w:bCs w:val="1"/>
+                <w:sz w:val="16"/>
+                <w:szCs w:val="16"/>
+              </w:rPr>
+            </w:pPr>
+            <w:r/>
+            <w:r>
+              <w:rPr>
+                <w:sz w:val="20"/>
+              </w:rPr>
+            </w:r>
+          </w:p>
+        </w:tc>
+        <w:tc>
+          <w:tcPr/>
+          <w:p>
+            <w:pPr>
+              <w:spacing w:line="360" w:lineRule="auto"/>
+              <w:jc w:val="left"/>
+              <w:rPr>
+                <w:b w:val="1"/>
+                <w:bCs w:val="1"/>
+                <w:sz w:val="16"/>
+                <w:szCs w:val="16"/>
+              </w:rPr>
+            </w:pPr>
+            <w:r/>
+            <w:r>
+              <w:rPr>
+                <w:sz w:val="20"/>
+              </w:rPr>
+            </w:r>
+          </w:p>
+        </w:tc>
+        <w:tc>
+          <w:tcPr/>
+          <w:p>
+            <w:pPr>
+              <w:spacing w:line="360" w:lineRule="auto"/>
+              <w:jc w:val="left"/>
+              <w:rPr>
+                <w:b w:val="1"/>
+                <w:bCs w:val="1"/>
+                <w:sz w:val="16"/>
+                <w:szCs w:val="16"/>
+              </w:rPr>
+            </w:pPr>
+            <w:r/>
+            <w:r>
+              <w:rPr>
+                <w:sz w:val="20"/>
+              </w:rPr>
+            </w:r>
+          </w:p>
+        </w:tc>
+        <w:tc>
+          <w:tcPr/>
+          <w:p>
+            <w:pPr>
+              <w:spacing w:line="360" w:lineRule="auto"/>
+              <w:jc w:val="left"/>
+              <w:rPr>
+                <w:b w:val="1"/>
+                <w:bCs w:val="1"/>
+                <w:sz w:val="16"/>
+                <w:szCs w:val="16"/>
+              </w:rPr>
+            </w:pPr>
+            <w:r/>
+            <w:r>
+              <w:rPr>
+                <w:sz w:val="20"/>
+              </w:rPr>
+            </w:r>
+          </w:p>
+        </w:tc>
+        <w:tc>
+          <w:tcPr/>
+          <w:p>
+            <w:pPr>
+              <w:spacing w:line="360" w:lineRule="auto"/>
+              <w:jc w:val="left"/>
+              <w:rPr>
+                <w:b w:val="1"/>
+                <w:bCs w:val="1"/>
+                <w:sz w:val="16"/>
+                <w:szCs w:val="16"/>
+              </w:rPr>
+            </w:pPr>
+            <w:r/>
+            <w:r>
+              <w:rPr>
+                <w:sz w:val="20"/>
+              </w:rPr>
+            </w:r>
+          </w:p>
+        </w:tc>
+        <w:tc>
+          <w:tcPr/>
+          <w:p>
+            <w:pPr>
+              <w:spacing w:line="360" w:lineRule="auto"/>
+              <w:jc w:val="left"/>
+              <w:rPr>
+                <w:b w:val="1"/>
+                <w:bCs w:val="1"/>
+                <w:sz w:val="16"/>
+                <w:szCs w:val="16"/>
+              </w:rPr>
+            </w:pPr>
+            <w:r/>
+            <w:r>
+              <w:rPr>
+                <w:sz w:val="20"/>
+              </w:rPr>
+            </w:r>
+          </w:p>
+        </w:tc>
+        <w:tc>
+          <w:tcPr/>
+          <w:p>
+            <w:pPr>
+              <w:spacing w:line="360" w:lineRule="auto"/>
+              <w:jc w:val="left"/>
+              <w:rPr>
+                <w:b w:val="1"/>
+                <w:bCs w:val="1"/>
+                <w:sz w:val="16"/>
+                <w:szCs w:val="16"/>
+              </w:rPr>
+            </w:pPr>
+            <w:r/>
+            <w:r>
+              <w:rPr>
+                <w:sz w:val="20"/>
+              </w:rPr>
+            </w:r>
+          </w:p>
+        </w:tc>
+        <w:tc>
+          <w:tcPr/>
+          <w:p>
+            <w:pPr>
+              <w:spacing w:line="360" w:lineRule="auto"/>
+              <w:jc w:val="left"/>
+              <w:rPr>
+                <w:b w:val="1"/>
+                <w:bCs w:val="1"/>
+                <w:sz w:val="16"/>
+                <w:szCs w:val="16"/>
+              </w:rPr>
+            </w:pPr>
+            <w:r/>
+            <w:r>
+              <w:rPr>
+                <w:sz w:val="20"/>
+              </w:rPr>
+            </w:r>
+          </w:p>
+        </w:tc>
+        <w:tc>
+          <w:tcPr/>
+          <w:p>
+            <w:pPr>
+              <w:spacing w:line="360" w:lineRule="auto"/>
+              <w:jc w:val="left"/>
+              <w:rPr>
+                <w:b w:val="1"/>
+                <w:bCs w:val="1"/>
+                <w:sz w:val="16"/>
+                <w:szCs w:val="16"/>
+              </w:rPr>
+            </w:pPr>
+            <w:r/>
+            <w:r>
+              <w:rPr>
+                <w:sz w:val="20"/>
+              </w:rPr>
+            </w:r>
+          </w:p>
+        </w:tc>
+        <w:tc>
+          <w:tcPr/>
+          <w:p>
+            <w:pPr>
+              <w:spacing w:line="360" w:lineRule="auto"/>
+              <w:jc w:val="left"/>
+              <w:rPr>
+                <w:b w:val="1"/>
+                <w:bCs w:val="1"/>
+                <w:sz w:val="16"/>
+                <w:szCs w:val="16"/>
+              </w:rPr>
+            </w:pPr>
+            <w:r/>
+            <w:r>
+              <w:rPr>
+                <w:sz w:val="20"/>
+              </w:rPr>
+            </w:r>
+          </w:p>
+        </w:tc>
+        <w:tc>
+          <w:tcPr/>
+          <w:p>
+            <w:pPr>
+              <w:spacing w:line="360" w:lineRule="auto"/>
+              <w:jc w:val="left"/>
+              <w:rPr>
+                <w:b w:val="1"/>
+                <w:bCs w:val="1"/>
+                <w:sz w:val="16"/>
+                <w:szCs w:val="16"/>
+              </w:rPr>
+            </w:pPr>
+            <w:r/>
+            <w:r>
+              <w:rPr>
+                <w:sz w:val="20"/>
+              </w:rPr>
+            </w:r>
+          </w:p>
+        </w:tc>
+        <w:tc>
+          <w:tcPr/>
+          <w:p>
+            <w:pPr>
+              <w:spacing w:line="360" w:lineRule="auto"/>
+              <w:jc w:val="left"/>
+              <w:rPr>
+                <w:b w:val="1"/>
+                <w:bCs w:val="1"/>
+                <w:sz w:val="16"/>
+                <w:szCs w:val="16"/>
+              </w:rPr>
+            </w:pPr>
+            <w:r/>
+            <w:r>
+              <w:rPr>
+                <w:sz w:val="20"/>
+              </w:rPr>
+            </w:r>
+          </w:p>
+        </w:tc>
+        <w:tc>
+          <w:tcPr/>
+          <w:p>
+            <w:pPr>
+              <w:spacing w:line="360" w:lineRule="auto"/>
+              <w:jc w:val="left"/>
+              <w:rPr>
+                <w:b w:val="1"/>
+                <w:bCs w:val="1"/>
+                <w:sz w:val="16"/>
+                <w:szCs w:val="16"/>
+              </w:rPr>
+            </w:pPr>
+            <w:r/>
+            <w:r>
+              <w:rPr>
+                <w:sz w:val="20"/>
+              </w:rPr>
+              <w:t>X</w:t>
+            </w:r>
+          </w:p>
+        </w:tc>
+        <w:tc>
+          <w:tcPr/>
+          <w:p>
+            <w:pPr>
+              <w:spacing w:line="360" w:lineRule="auto"/>
+              <w:jc w:val="left"/>
+              <w:rPr>
+                <w:b w:val="1"/>
+                <w:bCs w:val="1"/>
+                <w:sz w:val="16"/>
+                <w:szCs w:val="16"/>
+              </w:rPr>
+            </w:pPr>
+            <w:r/>
+            <w:r>
+              <w:rPr>
+                <w:sz w:val="20"/>
+              </w:rPr>
+            </w:r>
+          </w:p>
+        </w:tc>
+        <w:tc>
+          <w:tcPr>
+            <w:gridSpan w:val="2"/>
+          </w:tcPr>
+          <w:p>
+            <w:pPr>
+              <w:spacing w:line="360" w:lineRule="auto"/>
+              <w:jc w:val="left"/>
+              <w:rPr>
+                <w:b w:val="1"/>
+                <w:bCs w:val="1"/>
+                <w:sz w:val="16"/>
+                <w:szCs w:val="16"/>
+              </w:rPr>
+            </w:pPr>
+            <w:r/>
+            <w:r>
+              <w:rPr>
+                <w:sz w:val="20"/>
+              </w:rPr>
+            </w:r>
+          </w:p>
+        </w:tc>
+        <w:tc>
+          <w:tcPr/>
+          <w:p>
+            <w:pPr>
+              <w:spacing w:line="360" w:lineRule="auto"/>
+              <w:jc w:val="left"/>
+              <w:rPr>
+                <w:b w:val="1"/>
+                <w:bCs w:val="1"/>
+                <w:sz w:val="16"/>
+                <w:szCs w:val="16"/>
+              </w:rPr>
+            </w:pPr>
+            <w:r/>
+            <w:r>
+              <w:rPr>
+                <w:sz w:val="20"/>
+              </w:rPr>
+            </w:r>
+          </w:p>
+        </w:tc>
+        <w:tc>
+          <w:tcPr/>
+          <w:p>
+            <w:pPr>
+              <w:spacing w:line="360" w:lineRule="auto"/>
+              <w:jc w:val="left"/>
+              <w:rPr>
+                <w:b w:val="1"/>
+                <w:bCs w:val="1"/>
+                <w:sz w:val="16"/>
+                <w:szCs w:val="16"/>
+              </w:rPr>
+            </w:pPr>
+            <w:r/>
+            <w:r>
+              <w:rPr>
+                <w:sz w:val="20"/>
+              </w:rPr>
+            </w:r>
+          </w:p>
+        </w:tc>
+      </w:tr>
+      <w:tr>
+        <w:trPr>
+          <w:cantSplit w:val="0"/>
+          <w:trHeight w:val="294" w:hRule="atLeast"/>
+          <w:tblHeader w:val="0"/>
+        </w:trPr>
+        <w:tc>
+          <w:tcPr/>
+          <w:p>
+            <w:pPr>
+              <w:spacing w:line="360" w:lineRule="auto"/>
+              <w:jc w:val="left"/>
+              <w:rPr>
+                <w:b w:val="1"/>
+                <w:bCs w:val="1"/>
+                <w:sz w:val="16"/>
+                <w:szCs w:val="16"/>
+              </w:rPr>
+            </w:pPr>
+            <w:r/>
+            <w:r>
+              <w:rPr>
+                <w:sz w:val="20"/>
+              </w:rPr>
+              <w:t>Detección de ruido fuerte</w:t>
+            </w:r>
+          </w:p>
+        </w:tc>
+        <w:tc>
+          <w:tcPr/>
+          <w:p>
+            <w:pPr>
+              <w:spacing w:line="360" w:lineRule="auto"/>
+              <w:jc w:val="left"/>
+              <w:rPr>
+                <w:b w:val="1"/>
+                <w:bCs w:val="1"/>
+                <w:sz w:val="16"/>
+                <w:szCs w:val="16"/>
+              </w:rPr>
+            </w:pPr>
+            <w:r/>
+            <w:r>
+              <w:rPr>
+                <w:sz w:val="20"/>
+              </w:rPr>
+            </w:r>
+          </w:p>
+        </w:tc>
+        <w:tc>
+          <w:tcPr/>
+          <w:p>
+            <w:pPr>
+              <w:spacing w:line="360" w:lineRule="auto"/>
+              <w:jc w:val="left"/>
+              <w:rPr>
+                <w:b w:val="1"/>
+                <w:bCs w:val="1"/>
+                <w:sz w:val="16"/>
+                <w:szCs w:val="16"/>
+              </w:rPr>
+            </w:pPr>
+            <w:r/>
+            <w:r>
+              <w:rPr>
+                <w:sz w:val="20"/>
+              </w:rPr>
+            </w:r>
+          </w:p>
+        </w:tc>
+        <w:tc>
+          <w:tcPr/>
+          <w:p>
+            <w:pPr>
+              <w:spacing w:line="360" w:lineRule="auto"/>
+              <w:jc w:val="left"/>
+              <w:rPr>
+                <w:b w:val="1"/>
+                <w:bCs w:val="1"/>
+                <w:sz w:val="16"/>
+                <w:szCs w:val="16"/>
+              </w:rPr>
+            </w:pPr>
+            <w:r/>
+            <w:r>
+              <w:rPr>
+                <w:sz w:val="20"/>
+              </w:rPr>
+            </w:r>
+          </w:p>
+        </w:tc>
+        <w:tc>
+          <w:tcPr/>
+          <w:p>
+            <w:pPr>
+              <w:spacing w:line="360" w:lineRule="auto"/>
+              <w:jc w:val="left"/>
+              <w:rPr>
+                <w:b w:val="1"/>
+                <w:bCs w:val="1"/>
+                <w:sz w:val="16"/>
+                <w:szCs w:val="16"/>
+              </w:rPr>
+            </w:pPr>
+            <w:r/>
+            <w:r>
+              <w:rPr>
+                <w:sz w:val="20"/>
+              </w:rPr>
+            </w:r>
+          </w:p>
+        </w:tc>
+        <w:tc>
+          <w:tcPr/>
+          <w:p>
+            <w:pPr>
+              <w:spacing w:line="360" w:lineRule="auto"/>
+              <w:jc w:val="left"/>
+              <w:rPr>
+                <w:b w:val="1"/>
+                <w:bCs w:val="1"/>
+                <w:sz w:val="16"/>
+                <w:szCs w:val="16"/>
+              </w:rPr>
+            </w:pPr>
+            <w:r/>
+            <w:r>
+              <w:rPr>
+                <w:sz w:val="20"/>
+              </w:rPr>
+            </w:r>
+          </w:p>
+        </w:tc>
+        <w:tc>
+          <w:tcPr/>
+          <w:p>
+            <w:pPr>
+              <w:spacing w:line="360" w:lineRule="auto"/>
+              <w:jc w:val="left"/>
+              <w:rPr>
+                <w:b w:val="1"/>
+                <w:bCs w:val="1"/>
+                <w:sz w:val="16"/>
+                <w:szCs w:val="16"/>
+              </w:rPr>
+            </w:pPr>
+            <w:r/>
+            <w:r>
+              <w:rPr>
+                <w:sz w:val="20"/>
+              </w:rPr>
+            </w:r>
+          </w:p>
+        </w:tc>
+        <w:tc>
+          <w:tcPr/>
+          <w:p>
+            <w:pPr>
+              <w:spacing w:line="360" w:lineRule="auto"/>
+              <w:jc w:val="left"/>
+              <w:rPr>
+                <w:b w:val="1"/>
+                <w:bCs w:val="1"/>
+                <w:sz w:val="16"/>
+                <w:szCs w:val="16"/>
+              </w:rPr>
+            </w:pPr>
+            <w:r/>
+            <w:r>
+              <w:rPr>
+                <w:sz w:val="20"/>
+              </w:rPr>
+            </w:r>
+          </w:p>
+        </w:tc>
+        <w:tc>
+          <w:tcPr/>
+          <w:p>
+            <w:pPr>
+              <w:spacing w:line="360" w:lineRule="auto"/>
+              <w:jc w:val="left"/>
+              <w:rPr>
+                <w:b w:val="1"/>
+                <w:bCs w:val="1"/>
+                <w:sz w:val="16"/>
+                <w:szCs w:val="16"/>
+              </w:rPr>
+            </w:pPr>
+            <w:r/>
+            <w:r>
+              <w:rPr>
+                <w:sz w:val="20"/>
+              </w:rPr>
+            </w:r>
+          </w:p>
+        </w:tc>
+        <w:tc>
+          <w:tcPr/>
+          <w:p>
+            <w:pPr>
+              <w:spacing w:line="360" w:lineRule="auto"/>
+              <w:jc w:val="left"/>
+              <w:rPr>
+                <w:b w:val="1"/>
+                <w:bCs w:val="1"/>
+                <w:sz w:val="16"/>
+                <w:szCs w:val="16"/>
+              </w:rPr>
+            </w:pPr>
+            <w:r/>
+            <w:r>
+              <w:rPr>
+                <w:sz w:val="20"/>
+              </w:rPr>
+            </w:r>
+          </w:p>
+        </w:tc>
+        <w:tc>
+          <w:tcPr/>
+          <w:p>
+            <w:pPr>
+              <w:spacing w:line="360" w:lineRule="auto"/>
+              <w:jc w:val="left"/>
+              <w:rPr>
+                <w:b w:val="1"/>
+                <w:bCs w:val="1"/>
+                <w:sz w:val="16"/>
+                <w:szCs w:val="16"/>
+              </w:rPr>
+            </w:pPr>
+            <w:r/>
+            <w:r>
+              <w:rPr>
+                <w:sz w:val="20"/>
+              </w:rPr>
+            </w:r>
+          </w:p>
+        </w:tc>
+        <w:tc>
+          <w:tcPr/>
+          <w:p>
+            <w:pPr>
+              <w:spacing w:line="360" w:lineRule="auto"/>
+              <w:jc w:val="left"/>
+              <w:rPr>
+                <w:b w:val="1"/>
+                <w:bCs w:val="1"/>
+                <w:sz w:val="16"/>
+                <w:szCs w:val="16"/>
+              </w:rPr>
+            </w:pPr>
+            <w:r/>
+            <w:r>
+              <w:rPr>
+                <w:sz w:val="20"/>
+              </w:rPr>
+            </w:r>
+          </w:p>
+        </w:tc>
+        <w:tc>
+          <w:tcPr/>
+          <w:p>
+            <w:pPr>
+              <w:spacing w:line="360" w:lineRule="auto"/>
+              <w:jc w:val="left"/>
+              <w:rPr>
+                <w:b w:val="1"/>
+                <w:bCs w:val="1"/>
+                <w:sz w:val="16"/>
+                <w:szCs w:val="16"/>
+              </w:rPr>
+            </w:pPr>
+            <w:r/>
+            <w:r>
+              <w:rPr>
+                <w:sz w:val="20"/>
+              </w:rPr>
+            </w:r>
+          </w:p>
+        </w:tc>
+        <w:tc>
+          <w:tcPr/>
+          <w:p>
+            <w:pPr>
+              <w:spacing w:line="360" w:lineRule="auto"/>
+              <w:jc w:val="left"/>
+              <w:rPr>
+                <w:b w:val="1"/>
+                <w:bCs w:val="1"/>
+                <w:sz w:val="16"/>
+                <w:szCs w:val="16"/>
+              </w:rPr>
+            </w:pPr>
+            <w:r/>
+            <w:r>
+              <w:rPr>
+                <w:sz w:val="20"/>
+              </w:rPr>
+            </w:r>
+          </w:p>
+        </w:tc>
+        <w:tc>
+          <w:tcPr/>
+          <w:p>
+            <w:pPr>
+              <w:spacing w:line="360" w:lineRule="auto"/>
+              <w:jc w:val="left"/>
+              <w:rPr>
+                <w:b w:val="1"/>
+                <w:bCs w:val="1"/>
+                <w:sz w:val="16"/>
+                <w:szCs w:val="16"/>
+              </w:rPr>
+            </w:pPr>
+            <w:r/>
+            <w:r>
+              <w:rPr>
+                <w:sz w:val="20"/>
+              </w:rPr>
+            </w:r>
+          </w:p>
+        </w:tc>
+        <w:tc>
+          <w:tcPr/>
+          <w:p>
+            <w:pPr>
+              <w:spacing w:line="360" w:lineRule="auto"/>
+              <w:jc w:val="left"/>
+              <w:rPr>
+                <w:b w:val="1"/>
+                <w:bCs w:val="1"/>
+                <w:sz w:val="16"/>
+                <w:szCs w:val="16"/>
+              </w:rPr>
+            </w:pPr>
+            <w:r/>
+            <w:r>
+              <w:rPr>
+                <w:sz w:val="20"/>
+              </w:rPr>
+              <w:t>X</w:t>
+            </w:r>
+          </w:p>
+        </w:tc>
+        <w:tc>
+          <w:tcPr>
+            <w:gridSpan w:val="2"/>
+          </w:tcPr>
+          <w:p>
+            <w:pPr>
+              <w:spacing w:line="360" w:lineRule="auto"/>
+              <w:jc w:val="left"/>
+              <w:rPr>
+                <w:b w:val="1"/>
+                <w:bCs w:val="1"/>
+                <w:sz w:val="16"/>
+                <w:szCs w:val="16"/>
+              </w:rPr>
+            </w:pPr>
+            <w:r/>
+            <w:r>
+              <w:rPr>
+                <w:sz w:val="20"/>
+              </w:rPr>
+            </w:r>
+          </w:p>
+        </w:tc>
+        <w:tc>
+          <w:tcPr/>
+          <w:p>
+            <w:pPr>
+              <w:spacing w:line="360" w:lineRule="auto"/>
+              <w:jc w:val="left"/>
+              <w:rPr>
+                <w:b w:val="1"/>
+                <w:bCs w:val="1"/>
+                <w:sz w:val="16"/>
+                <w:szCs w:val="16"/>
+              </w:rPr>
+            </w:pPr>
+            <w:r/>
+            <w:r>
+              <w:rPr>
+                <w:sz w:val="20"/>
+              </w:rPr>
+            </w:r>
+          </w:p>
+        </w:tc>
+        <w:tc>
+          <w:tcPr/>
+          <w:p>
+            <w:pPr>
+              <w:spacing w:line="360" w:lineRule="auto"/>
+              <w:jc w:val="left"/>
+              <w:rPr>
+                <w:b w:val="1"/>
+                <w:bCs w:val="1"/>
+                <w:sz w:val="16"/>
+                <w:szCs w:val="16"/>
+              </w:rPr>
+            </w:pPr>
+            <w:r/>
+            <w:r>
+              <w:rPr>
+                <w:sz w:val="20"/>
               </w:rPr>
             </w:r>
           </w:p>

</xml_diff>